<commit_message>
Add DMG gateway option, infuse Demo2Win methodology into demo scripts
- Add Qlik Data Movement Gateway as optional deployment (submodule + 3 compose files)
  - docker-compose.dmg.yml: privileged DMG container (PG/MySQL/MSSQL/Gateway)
  - docker-compose.simulators-dmg.yml: simulators targeting DMG's PostgreSQL
  - docker-compose.full-stack-dmg.yml: full stack with Kafka + DMG + simulators
- Infuse Demo2Win and Show-Tell-Show methodology into all 13 demo scripts
  - Limbic Openings, Tell annotations, interaction prompts, value chains
  - Existing MCG content preserved — methodology added as supplementary sections
- Fix glossary: Trust Score scale (0-1.0), cold chain thresholds, data product counts
- Regenerate all outputs (PPTX, DOCX, Excel)

Co-Authored-By: Claude Opus 4.6 <noreply@anthropic.com>
</commit_message>
<xml_diff>
--- a/documents/demo-scripts/01_Infrastructure_Data_Sources.docx
+++ b/documents/demo-scripts/01_Infrastructure_Data_Sources.docx
@@ -554,9 +554,207 @@
           <w:sz w:val="26"/>
           <w:szCs w:val="26"/>
         </w:rPr>
+        <w:t xml:space="preserve">Demo Methodology: Tell → Show → Tell</w:t>
+      </w:r>
+    </w:p>
+    <w:tbl>
+      <w:tblPr>
+        <w:tblW w:type="pct" w:w="100%"/>
+        <w:tblBorders>
+          <w:top w:val="single" w:color="auto" w:sz="4"/>
+          <w:left w:val="single" w:color="auto" w:sz="4"/>
+          <w:bottom w:val="single" w:color="auto" w:sz="4"/>
+          <w:right w:val="single" w:color="auto" w:sz="4"/>
+          <w:insideH w:val="single" w:color="auto" w:sz="4"/>
+          <w:insideV w:val="single" w:color="auto" w:sz="4"/>
+        </w:tblBorders>
+      </w:tblPr>
+      <w:tblGrid>
+        <w:gridCol w:w="100"/>
+        <w:gridCol w:w="100"/>
+      </w:tblGrid>
+      <w:tr>
+        <w:tc>
+          <w:tcPr>
+            <w:tcW w:type="pct" w:w="2%"/>
+            <w:tcBorders>
+              <w:top w:val="none"/>
+              <w:left w:val="none"/>
+              <w:bottom w:val="none"/>
+              <w:right w:val="none"/>
+            </w:tcBorders>
+            <w:shd w:color="19416C" w:val="solid"/>
+          </w:tcPr>
+          <w:p>
+            <w:pPr>
+              <w:spacing w:after="0"/>
+            </w:pPr>
+            <w:r>
+              <w:rPr>
+                <w:sz w:val="10"/>
+                <w:szCs w:val="10"/>
+              </w:rPr>
+              <w:t xml:space="preserve"> </w:t>
+            </w:r>
+          </w:p>
+        </w:tc>
+        <w:tc>
+          <w:tcPr>
+            <w:tcW w:type="pct" w:w="98%"/>
+            <w:shd w:color="E3EAF3" w:val="solid"/>
+            <w:tcMar>
+              <w:top w:type="dxa" w:w="60"/>
+              <w:left w:type="dxa" w:w="120"/>
+              <w:bottom w:type="dxa" w:w="60"/>
+              <w:right w:type="dxa" w:w="120"/>
+            </w:tcMar>
+          </w:tcPr>
+          <w:p>
+            <w:pPr>
+              <w:spacing w:after="40"/>
+            </w:pPr>
+            <w:r>
+              <w:rPr>
+                <w:rFonts w:ascii="Inter" w:cs="Inter" w:eastAsia="Inter" w:hAnsi="Inter"/>
+                <w:b/>
+                <w:bCs/>
+                <w:color w:val="19416C"/>
+                <w:sz w:val="18"/>
+                <w:szCs w:val="18"/>
+              </w:rPr>
+              <w:t xml:space="preserve">Limbic Opening  (Problem/Consequence)</w:t>
+            </w:r>
+          </w:p>
+          <w:p>
+            <w:pPr>
+              <w:spacing w:after="0"/>
+            </w:pPr>
+            <w:r>
+              <w:rPr>
+                <w:rFonts w:ascii="Inter" w:cs="Inter" w:eastAsia="Inter" w:hAnsi="Inter"/>
+                <w:i/>
+                <w:iCs/>
+                <w:color w:val="454659"/>
+                <w:sz w:val="20"/>
+                <w:szCs w:val="20"/>
+              </w:rPr>
+              <w:t xml:space="preserve">It's Monday morning. Henrik Jansen gets a call: 200 orders shipped over the weekend are wrong. The WMS said the inventory was there — it wasn't. Phantom inventory. $48 million a year in write-offs, and nobody knew until customers started calling. What if he could have seen the discrepancy before those orders shipped?</w:t>
+            </w:r>
+          </w:p>
+        </w:tc>
+      </w:tr>
+    </w:tbl>
+    <w:p>
+      <w:pPr>
+        <w:spacing w:after="80" w:before="80"/>
+      </w:pPr>
+      <w:r>
+        <w:rPr>
+          <w:rFonts w:ascii="Inter" w:cs="Inter" w:eastAsia="Inter" w:hAnsi="Inter"/>
+          <w:b/>
+          <w:bCs/>
+          <w:color w:val="10CFC9"/>
+          <w:sz w:val="20"/>
+          <w:szCs w:val="20"/>
+        </w:rPr>
+        <w:t xml:space="preserve">Ask the audience: </w:t>
+      </w:r>
+      <w:r>
+        <w:rPr>
+          <w:rFonts w:ascii="Inter" w:cs="Inter" w:eastAsia="Inter" w:hAnsi="Inter"/>
+          <w:i/>
+          <w:iCs/>
+          <w:color w:val="454659"/>
+          <w:sz w:val="20"/>
+          <w:szCs w:val="20"/>
+        </w:rPr>
+        <w:t xml:space="preserve">"How does your team currently know when inventory data doesn't match reality?"</w:t>
+      </w:r>
+    </w:p>
+    <w:p>
+      <w:pPr>
+        <w:spacing w:after="120" w:before="280"/>
+      </w:pPr>
+      <w:r>
+        <w:rPr>
+          <w:rFonts w:ascii="Inter" w:cs="Inter" w:eastAsia="Inter" w:hAnsi="Inter"/>
+          <w:b/>
+          <w:bCs/>
+          <w:color w:val="006580"/>
+          <w:sz w:val="26"/>
+          <w:szCs w:val="26"/>
+        </w:rPr>
         <w:t xml:space="preserve">Demo Walk-Through</w:t>
       </w:r>
     </w:p>
+    <w:tbl>
+      <w:tblPr>
+        <w:tblW w:type="pct" w:w="100%"/>
+        <w:tblBorders>
+          <w:top w:val="single" w:color="auto" w:sz="4"/>
+          <w:left w:val="single" w:color="auto" w:sz="4"/>
+          <w:bottom w:val="single" w:color="auto" w:sz="4"/>
+          <w:right w:val="single" w:color="auto" w:sz="4"/>
+          <w:insideH w:val="single" w:color="auto" w:sz="4"/>
+          <w:insideV w:val="single" w:color="auto" w:sz="4"/>
+        </w:tblBorders>
+      </w:tblPr>
+      <w:tblGrid>
+        <w:gridCol w:w="100"/>
+      </w:tblGrid>
+      <w:tr>
+        <w:tc>
+          <w:tcPr>
+            <w:tcW w:type="pct" w:w="100%"/>
+            <w:tcBorders>
+              <w:top w:val="single" w:color="006580" w:sz="1"/>
+              <w:left w:val="single" w:color="006580" w:sz="6"/>
+              <w:bottom w:val="single" w:color="006580" w:sz="1"/>
+              <w:right w:val="none"/>
+            </w:tcBorders>
+            <w:shd w:color="E0F2F5" w:val="solid"/>
+            <w:tcMar>
+              <w:top w:type="dxa" w:w="40"/>
+              <w:left w:type="dxa" w:w="120"/>
+              <w:bottom w:type="dxa" w:w="40"/>
+              <w:right w:type="dxa" w:w="120"/>
+            </w:tcMar>
+          </w:tcPr>
+          <w:p>
+            <w:pPr>
+              <w:spacing w:after="30"/>
+            </w:pPr>
+            <w:r>
+              <w:rPr>
+                <w:rFonts w:ascii="Inter" w:cs="Inter" w:eastAsia="Inter" w:hAnsi="Inter"/>
+                <w:b/>
+                <w:bCs/>
+                <w:color w:val="006580"/>
+                <w:sz w:val="16"/>
+                <w:szCs w:val="16"/>
+              </w:rPr>
+              <w:t xml:space="preserve">TELL (before showing)</w:t>
+            </w:r>
+          </w:p>
+          <w:p>
+            <w:pPr>
+              <w:spacing w:after="0"/>
+            </w:pPr>
+            <w:r>
+              <w:rPr>
+                <w:rFonts w:ascii="Inter" w:cs="Inter" w:eastAsia="Inter" w:hAnsi="Inter"/>
+                <w:i/>
+                <w:iCs/>
+                <w:color w:val="454659"/>
+                <w:sz w:val="18"/>
+                <w:szCs w:val="18"/>
+              </w:rPr>
+              <w:t xml:space="preserve">Before showing the infrastructure, set context: MCG has three completely independent data systems — a warehouse database, IoT sensors on trucks, and a CRM. None of them talk to each other. That's the starting point. Now let me show you where this data lives.</w:t>
+            </w:r>
+          </w:p>
+        </w:tc>
+      </w:tr>
+    </w:tbl>
     <w:p>
       <w:pPr>
         <w:spacing w:after="100" w:before="200"/>
@@ -1799,6 +1997,155 @@
         </w:tc>
       </w:tr>
     </w:tbl>
+    <w:tbl>
+      <w:tblPr>
+        <w:tblW w:type="pct" w:w="100%"/>
+        <w:tblBorders>
+          <w:top w:val="single" w:color="auto" w:sz="4"/>
+          <w:left w:val="single" w:color="auto" w:sz="4"/>
+          <w:bottom w:val="single" w:color="auto" w:sz="4"/>
+          <w:right w:val="single" w:color="auto" w:sz="4"/>
+          <w:insideH w:val="single" w:color="auto" w:sz="4"/>
+          <w:insideV w:val="single" w:color="auto" w:sz="4"/>
+        </w:tblBorders>
+      </w:tblPr>
+      <w:tblGrid>
+        <w:gridCol w:w="100"/>
+      </w:tblGrid>
+      <w:tr>
+        <w:tc>
+          <w:tcPr>
+            <w:tcW w:type="pct" w:w="100%"/>
+            <w:tcBorders>
+              <w:top w:val="single" w:color="009845" w:sz="1"/>
+              <w:left w:val="single" w:color="009845" w:sz="6"/>
+              <w:bottom w:val="single" w:color="009845" w:sz="1"/>
+              <w:right w:val="none"/>
+            </w:tcBorders>
+            <w:shd w:color="E0F5EA" w:val="solid"/>
+            <w:tcMar>
+              <w:top w:type="dxa" w:w="40"/>
+              <w:left w:type="dxa" w:w="120"/>
+              <w:bottom w:type="dxa" w:w="40"/>
+              <w:right w:type="dxa" w:w="120"/>
+            </w:tcMar>
+          </w:tcPr>
+          <w:p>
+            <w:pPr>
+              <w:spacing w:after="30"/>
+            </w:pPr>
+            <w:r>
+              <w:rPr>
+                <w:rFonts w:ascii="Inter" w:cs="Inter" w:eastAsia="Inter" w:hAnsi="Inter"/>
+                <w:b/>
+                <w:bCs/>
+                <w:color w:val="009845"/>
+                <w:sz w:val="16"/>
+                <w:szCs w:val="16"/>
+              </w:rPr>
+              <w:t xml:space="preserve">TELL (after showing)</w:t>
+            </w:r>
+          </w:p>
+          <w:p>
+            <w:pPr>
+              <w:spacing w:after="0"/>
+            </w:pPr>
+            <w:r>
+              <w:rPr>
+                <w:rFonts w:ascii="Inter" w:cs="Inter" w:eastAsia="Inter" w:hAnsi="Inter"/>
+                <w:i/>
+                <w:iCs/>
+                <w:color w:val="454659"/>
+                <w:sz w:val="18"/>
+                <w:szCs w:val="18"/>
+              </w:rPr>
+              <w:t xml:space="preserve">So what you just saw are three real data sources — a warehouse database, IoT cold-chain sensors, and a CRM — all generating data with real-world quality problems baked in. This is not sanitized demo data. This is how supply chain data actually looks.</w:t>
+            </w:r>
+          </w:p>
+        </w:tc>
+      </w:tr>
+    </w:tbl>
+    <w:p>
+      <w:pPr>
+        <w:spacing w:after="80" w:before="80"/>
+      </w:pPr>
+      <w:r>
+        <w:rPr>
+          <w:rFonts w:ascii="Inter" w:cs="Inter" w:eastAsia="Inter" w:hAnsi="Inter"/>
+          <w:b/>
+          <w:bCs/>
+          <w:color w:val="10CFC9"/>
+          <w:sz w:val="20"/>
+          <w:szCs w:val="20"/>
+        </w:rPr>
+        <w:t xml:space="preserve">Ask the audience: </w:t>
+      </w:r>
+      <w:r>
+        <w:rPr>
+          <w:rFonts w:ascii="Inter" w:cs="Inter" w:eastAsia="Inter" w:hAnsi="Inter"/>
+          <w:i/>
+          <w:iCs/>
+          <w:color w:val="454659"/>
+          <w:sz w:val="20"/>
+          <w:szCs w:val="20"/>
+        </w:rPr>
+        <w:t xml:space="preserve">"Does this feel familiar? How many disconnected data sources does your team deal with today?"</w:t>
+      </w:r>
+    </w:p>
+    <w:p>
+      <w:pPr>
+        <w:spacing w:after="100" w:before="60"/>
+      </w:pPr>
+      <w:r>
+        <w:rPr>
+          <w:rFonts w:ascii="Inter" w:cs="Inter" w:eastAsia="Inter" w:hAnsi="Inter"/>
+          <w:color w:val="454659"/>
+          <w:sz w:val="20"/>
+          <w:szCs w:val="20"/>
+        </w:rPr>
+        <w:t xml:space="preserve">Ingest data from three independent systems in real-time</w:t>
+      </w:r>
+      <w:r>
+        <w:rPr>
+          <w:rFonts w:ascii="Inter" w:cs="Inter" w:eastAsia="Inter" w:hAnsi="Inter"/>
+          <w:b/>
+          <w:bCs/>
+          <w:color w:val="009845"/>
+          <w:sz w:val="20"/>
+          <w:szCs w:val="20"/>
+        </w:rPr>
+        <w:t xml:space="preserve">  →  so you can  </w:t>
+      </w:r>
+      <w:r>
+        <w:rPr>
+          <w:rFonts w:ascii="Inter" w:cs="Inter" w:eastAsia="Inter" w:hAnsi="Inter"/>
+          <w:color w:val="454659"/>
+          <w:sz w:val="20"/>
+          <w:szCs w:val="20"/>
+        </w:rPr>
+        <w:t xml:space="preserve">see the complete supply chain picture in one place</w:t>
+      </w:r>
+      <w:r>
+        <w:rPr>
+          <w:rFonts w:ascii="Inter" w:cs="Inter" w:eastAsia="Inter" w:hAnsi="Inter"/>
+          <w:b/>
+          <w:bCs/>
+          <w:color w:val="009845"/>
+          <w:sz w:val="20"/>
+          <w:szCs w:val="20"/>
+        </w:rPr>
+        <w:t xml:space="preserve">  →  so you can  </w:t>
+      </w:r>
+      <w:r>
+        <w:rPr>
+          <w:rFonts w:ascii="Inter" w:cs="Inter" w:eastAsia="Inter" w:hAnsi="Inter"/>
+          <w:color w:val="454659"/>
+          <w:sz w:val="20"/>
+          <w:szCs w:val="20"/>
+        </w:rPr>
+        <w:t xml:space="preserve">catch problems like phantom inventory before they cost $48M</w:t>
+      </w:r>
+    </w:p>
     <w:p>
       <w:pPr>
         <w:spacing w:after="120" w:before="280"/>

</xml_diff>

<commit_message>
Enforce Inter across Qlik-branded assets (brand_check clean)
qlik-brand brand_check flagged the non-brand mono font 'Consolas' (brand core
allows Inter only). Replace it in the Qlik-branded surfaces:
- gen-project-qlarity-summary.js / gen-agentic-engineering.js: MONO -> Inter
- qlik-doc-styles.js: Qlik doc theme mono -> Inter
- gen-demo-scripts.js: prompt-box font -> Inter

MCG in-world themes (mcg-styles.js, mcg-docx-builder.js) keep Consolas — that
is the fictional company's identity, not Qlik brand. Both decks and the demo
scripts now pass brand_check (0 blocking, 0 warn).

Co-Authored-By: Claude Opus 4.8 <noreply@anthropic.com>
</commit_message>
<xml_diff>
--- a/documents/demo-scripts/01_Infrastructure_Data_Sources.docx
+++ b/documents/demo-scripts/01_Infrastructure_Data_Sources.docx
@@ -975,7 +975,7 @@
             </w:pPr>
             <w:r>
               <w:rPr>
-                <w:rFonts w:ascii="Consolas" w:cs="Consolas" w:eastAsia="Consolas" w:hAnsi="Consolas"/>
+                <w:rFonts w:ascii="Inter" w:cs="Inter" w:eastAsia="Inter" w:hAnsi="Inter"/>
                 <w:color w:val="54565A"/>
                 <w:sz w:val="20"/>
                 <w:szCs w:val="20"/>
@@ -1116,7 +1116,7 @@
             </w:pPr>
             <w:r>
               <w:rPr>
-                <w:rFonts w:ascii="Consolas" w:cs="Consolas" w:eastAsia="Consolas" w:hAnsi="Consolas"/>
+                <w:rFonts w:ascii="Inter" w:cs="Inter" w:eastAsia="Inter" w:hAnsi="Inter"/>
                 <w:color w:val="54565A"/>
                 <w:sz w:val="20"/>
                 <w:szCs w:val="20"/>
@@ -1314,7 +1314,7 @@
             </w:pPr>
             <w:r>
               <w:rPr>
-                <w:rFonts w:ascii="Consolas" w:cs="Consolas" w:eastAsia="Consolas" w:hAnsi="Consolas"/>
+                <w:rFonts w:ascii="Inter" w:cs="Inter" w:eastAsia="Inter" w:hAnsi="Inter"/>
                 <w:color w:val="54565A"/>
                 <w:sz w:val="20"/>
                 <w:szCs w:val="20"/>
@@ -1427,7 +1427,7 @@
             </w:pPr>
             <w:r>
               <w:rPr>
-                <w:rFonts w:ascii="Consolas" w:cs="Consolas" w:eastAsia="Consolas" w:hAnsi="Consolas"/>
+                <w:rFonts w:ascii="Inter" w:cs="Inter" w:eastAsia="Inter" w:hAnsi="Inter"/>
                 <w:color w:val="54565A"/>
                 <w:sz w:val="20"/>
                 <w:szCs w:val="20"/>
@@ -1653,7 +1653,7 @@
             </w:pPr>
             <w:r>
               <w:rPr>
-                <w:rFonts w:ascii="Consolas" w:cs="Consolas" w:eastAsia="Consolas" w:hAnsi="Consolas"/>
+                <w:rFonts w:ascii="Inter" w:cs="Inter" w:eastAsia="Inter" w:hAnsi="Inter"/>
                 <w:color w:val="54565A"/>
                 <w:sz w:val="20"/>
                 <w:szCs w:val="20"/>
@@ -1963,7 +1963,7 @@
             </w:pPr>
             <w:r>
               <w:rPr>
-                <w:rFonts w:ascii="Consolas" w:cs="Consolas" w:eastAsia="Consolas" w:hAnsi="Consolas"/>
+                <w:rFonts w:ascii="Inter" w:cs="Inter" w:eastAsia="Inter" w:hAnsi="Inter"/>
                 <w:color w:val="54565A"/>
                 <w:sz w:val="20"/>
                 <w:szCs w:val="20"/>

</xml_diff>